<commit_message>
Replace Kamkom branding with Noosfera in BG DOCX templates.
Логотип, наименование, адрес, ИНН/КПП/ОГРН/БИК/корсчёт, лицензия №2650 и email в шаблонах Решение/Предложение/Договор. Расчётный счёт для комиссии оставлен пустым — уточнить у банка.

Co-authored-by: Alim Abdurakhmanov <alim-abdurakhmanov@users.noreply.github.com>
</commit_message>
<xml_diff>
--- a/templates/bg/common/decision.docx
+++ b/templates/bg/common/decision.docx
@@ -73,7 +73,7 @@
       <w:bookmarkStart w:id="0" w:name="_GoBack"/>
       <w:bookmarkEnd w:id="0"/>
       <w:r>
-        <w:t>г. Казань               «${decision_day}» ${decision_month} ${decision_year}г.</w:t>
+        <w:t>г. Щёлково               «${decision_day}» ${decision_month} ${decision_year}г.</w:t>
       </w:r>
     </w:p>
     <w:p>
@@ -97,7 +97,7 @@
         </w:rPr>
       </w:pPr>
       <w:r>
-        <w:t>ООО «Камкомбанк» (далее – Банк) в лице Начальника отдела банковских гарантий Ахмадуллина Фидаиля Фаргатовича, действующего на основании Доверенности от «${poa_day}» ${poa_month} ${poa_year}г. №${poa_number}, рассмотрев Анкету-заявление на предоставление банковской гарантии, решил предоставить банковскую гарантию на следующих условиях:</w:t>
+        <w:t>АКБ «НООСФЕРА» (АО) (далее – Банк) в лице ${guarantor_signatory}, действующего на основании Доверенности от «${poa_day}» ${poa_month} ${poa_year}г. №${poa_number}, рассмотрев Анкету-заявление на предоставление банковской гарантии, решил предоставить банковскую гарантию на следующих условиях:</w:t>
       </w:r>
     </w:p>
     <w:tbl>
@@ -1759,7 +1759,7 @@
           <w:sz w:val="24"/>
           <w:szCs w:val="24"/>
         </w:rPr>
-        <w:t>______________        /Ф.Ф.Ахмадуллин</w:t>
+        <w:t>______________        /_______________</w:t>
       </w:r>
       <w:r>
         <w:rPr>

</xml_diff>